<commit_message>
docs: intègre l'étude coûts VTC + corrige les chiffres marché (plan & deck)
- Intègre l'étude « Coûts d'exploitation VTC en CI » (mai 2026) au standard v2
  (md + pdf + docx), enregistrée dans build.sh + index ; retire l'ancien _3.pdf
- Corrige le dimensionnement VTC d'après sources 2026 :
  ~30 000 VTC nationaux (vs 5-6k en 2024), Yango ~25 000 véh / 100 000 courses
  jour / 160 entreprises, ~4 Mds F/jour de déplacements à Abidjan
- Marché pièces réévalué : TAM ~250 Mds, SAM Abidjan ~172 Mds, SOM 35-50 Mds ;
  VTC ~36 Mds (28k véh × 1,3 M)
- FleetOps ajouté à la cartographie concurrentielle (partenaire potentiel)
- Sources mises à jour dans le plan d'affaires

Co-Authored-By: Claude Opus 4.8 (1M context) <noreply@anthropic.com>
</commit_message>
<xml_diff>
--- a/docs/pitch-deck-pieces-2026-06.docx
+++ b/docs/pitch-deck-pieces-2026-06.docx
@@ -516,7 +516,7 @@
                 <w:b/>
                 <w:bCs/>
               </w:rPr>
-              <w:t xml:space="preserve">~210 Mds F</w:t>
+              <w:t xml:space="preserve">~250 Mds F</w:t>
             </w:r>
           </w:p>
         </w:tc>
@@ -554,7 +554,7 @@
                 <w:b/>
                 <w:bCs/>
               </w:rPr>
-              <w:t xml:space="preserve">~145 Mds F</w:t>
+              <w:t xml:space="preserve">~172 Mds F</w:t>
             </w:r>
           </w:p>
         </w:tc>
@@ -592,7 +592,7 @@
                 <w:b/>
                 <w:bCs/>
               </w:rPr>
-              <w:t xml:space="preserve">30–40 Mds F</w:t>
+              <w:t xml:space="preserve">35–50 Mds F</w:t>
             </w:r>
           </w:p>
         </w:tc>
@@ -613,13 +613,13 @@
           <w:b/>
           <w:bCs/>
         </w:rPr>
-        <w:t xml:space="preserve">3–5 Mds FCFA de revenu net annuel</w:t>
-      </w:r>
-      <w:r>
-        <w:t xml:space="preserve"> </w:t>
-      </w:r>
-      <w:r>
-        <w:t xml:space="preserve">(~5–8 M USD).</w:t>
+        <w:t xml:space="preserve">4–6 Mds FCFA de revenu net annuel</w:t>
+      </w:r>
+      <w:r>
+        <w:t xml:space="preserve"> </w:t>
+      </w:r>
+      <w:r>
+        <w:t xml:space="preserve">(~6–10 M USD).</w:t>
       </w:r>
     </w:p>
     <w:bookmarkEnd w:id="12"/>
@@ -661,10 +661,13 @@
           <w:b/>
           <w:bCs/>
         </w:rPr>
-        <w:t xml:space="preserve">Yango dominant</w:t>
-      </w:r>
-      <w:r>
-        <w:t xml:space="preserve">, bureau régional Afrique de l'Ouest ouvert à Abidjan. Un partenaire flotte évident.</w:t>
+        <w:t xml:space="preserve">Yango ultra-dominant</w:t>
+      </w:r>
+      <w:r>
+        <w:t xml:space="preserve"> </w:t>
+      </w:r>
+      <w:r>
+        <w:t xml:space="preserve">: ~25 000 véhicules, **~100 000 courses/jour**, 160+ entreprises de flotte, HQ régional à Abidjan. Un partenaire flotte évident.</w:t>
       </w:r>
     </w:p>
     <w:p>
@@ -748,7 +751,23 @@
         <w:pStyle w:val="FirstParagraph"/>
       </w:pPr>
       <w:r>
-        <w:t xml:space="preserve">Le VTC ivoirien (~6 000–8 000 véhicules, en croissance) est</w:t>
+        <w:t xml:space="preserve">Le VTC ivoirien a explosé :</w:t>
+      </w:r>
+      <w:r>
+        <w:t xml:space="preserve"> </w:t>
+      </w:r>
+      <w:r>
+        <w:rPr>
+          <w:b/>
+          <w:bCs/>
+        </w:rPr>
+        <w:t xml:space="preserve">~30 000 véhicules en 2026</w:t>
+      </w:r>
+      <w:r>
+        <w:t xml:space="preserve"> </w:t>
+      </w:r>
+      <w:r>
+        <w:t xml:space="preserve">(vs 5–6k en 2024), Yango ~25 000 à Abidjan. C'est</w:t>
       </w:r>
       <w:r>
         <w:t xml:space="preserve"> </w:t>
@@ -789,7 +808,20 @@
         <w:t xml:space="preserve"> </w:t>
       </w:r>
       <w:r>
-        <w:t xml:space="preserve">(3× un particulier) → use ses pièces 3× plus vite.</w:t>
+        <w:t xml:space="preserve">(3× un particulier) → use ses pièces 3× plus vite (</w:t>
+      </w:r>
+      <w:r>
+        <w:rPr>
+          <w:b/>
+          <w:bCs/>
+        </w:rPr>
+        <w:t xml:space="preserve">~1,3 M F/an</w:t>
+      </w:r>
+      <w:r>
+        <w:t xml:space="preserve"> </w:t>
+      </w:r>
+      <w:r>
+        <w:t xml:space="preserve">de pièces).</w:t>
       </w:r>
     </w:p>
     <w:p>
@@ -817,7 +849,7 @@
         <w:t xml:space="preserve"> </w:t>
       </w:r>
       <w:r>
-        <w:t xml:space="preserve">→ douleur aiguë et mesurable.</w:t>
+        <w:t xml:space="preserve">(15–30k F/jour) → douleur aiguë et mesurable.</w:t>
       </w:r>
     </w:p>
     <w:p>
@@ -829,7 +861,29 @@
         </w:numPr>
       </w:pPr>
       <w:r>
-        <w:t xml:space="preserve">Idéal pour prouver le ROI, bâtir les cas clients et la</w:t>
+        <w:rPr>
+          <w:b/>
+          <w:bCs/>
+        </w:rPr>
+        <w:t xml:space="preserve">~160 entreprises de flotte</w:t>
+      </w:r>
+      <w:r>
+        <w:t xml:space="preserve"> </w:t>
+      </w:r>
+      <w:r>
+        <w:t xml:space="preserve">Yango = cibles B2B concentrées et immédiates.</w:t>
+      </w:r>
+    </w:p>
+    <w:p>
+      <w:pPr>
+        <w:pStyle w:val="Compact"/>
+        <w:numPr>
+          <w:ilvl w:val="0"/>
+          <w:numId w:val="1005"/>
+        </w:numPr>
+      </w:pPr>
+      <w:r>
+        <w:t xml:space="preserve">Idéal pour prouver le ROI et bâtir la</w:t>
       </w:r>
       <w:r>
         <w:t xml:space="preserve"> </w:t>

</xml_diff>

<commit_message>
docs: rebuild complet de tous les documents + pitch deck en .pptx
- build.sh génère désormais un .pptx pour les decks (préprocesseur qui nettoie
  le HTML print-only en slides markdown ; une slide par ##, thème pandoc par défaut)
- pitch-deck : texte replacé avant les tableaux pour des slides propres (14 slides)
- Tous les docs régénérés (.pdf/.docx) au standard v2

Co-Authored-By: Claude Opus 4.8 (1M context) <noreply@anthropic.com>
</commit_message>
<xml_diff>
--- a/docs/pitch-deck-pieces-2026-06.docx
+++ b/docs/pitch-deck-pieces-2026-06.docx
@@ -446,7 +446,23 @@
         <w:t xml:space="preserve">~400–420 Mds F/an</w:t>
       </w:r>
       <w:r>
-        <w:t xml:space="preserve">.</w:t>
+        <w:t xml:space="preserve">. À une take rate de 9–12 %, le SOM représente</w:t>
+      </w:r>
+      <w:r>
+        <w:t xml:space="preserve"> </w:t>
+      </w:r>
+      <w:r>
+        <w:rPr>
+          <w:b/>
+          <w:bCs/>
+        </w:rPr>
+        <w:t xml:space="preserve">4–6 Mds FCFA de revenu net annuel</w:t>
+      </w:r>
+      <w:r>
+        <w:t xml:space="preserve"> </w:t>
+      </w:r>
+      <w:r>
+        <w:t xml:space="preserve">(~6–10 M USD).</w:t>
       </w:r>
     </w:p>
     <w:tbl>
@@ -598,30 +614,6 @@
         </w:tc>
       </w:tr>
     </w:tbl>
-    <w:p>
-      <w:pPr>
-        <w:pStyle w:val="BodyText"/>
-      </w:pPr>
-      <w:r>
-        <w:t xml:space="preserve">À une take rate de 9–12 %, le SOM représente</w:t>
-      </w:r>
-      <w:r>
-        <w:t xml:space="preserve"> </w:t>
-      </w:r>
-      <w:r>
-        <w:rPr>
-          <w:b/>
-          <w:bCs/>
-        </w:rPr>
-        <w:t xml:space="preserve">4–6 Mds FCFA de revenu net annuel</w:t>
-      </w:r>
-      <w:r>
-        <w:t xml:space="preserve"> </w:t>
-      </w:r>
-      <w:r>
-        <w:t xml:space="preserve">(~6–10 M USD).</w:t>
-      </w:r>
-    </w:p>
     <w:bookmarkEnd w:id="12"/>
     <w:bookmarkStart w:id="13" w:name="pourquoi-maintenant"/>
     <w:p>
@@ -907,6 +899,72 @@
       </w:pPr>
       <w:r>
         <w:t xml:space="preserve">Modèle économique</w:t>
+      </w:r>
+    </w:p>
+    <w:p>
+      <w:pPr>
+        <w:pStyle w:val="FirstParagraph"/>
+      </w:pPr>
+      <w:r>
+        <w:rPr>
+          <w:b/>
+          <w:bCs/>
+        </w:rPr>
+        <w:t xml:space="preserve">Unit economics</w:t>
+      </w:r>
+      <w:r>
+        <w:t xml:space="preserve"> </w:t>
+      </w:r>
+      <w:r>
+        <w:t xml:space="preserve">: revenu net</w:t>
+      </w:r>
+      <w:r>
+        <w:t xml:space="preserve"> </w:t>
+      </w:r>
+      <w:r>
+        <w:rPr>
+          <w:b/>
+          <w:bCs/>
+        </w:rPr>
+        <w:t xml:space="preserve">2 560 F/commande</w:t>
+      </w:r>
+      <w:r>
+        <w:t xml:space="preserve"> </w:t>
+      </w:r>
+      <w:r>
+        <w:t xml:space="preserve">· LTV Flotte Pro</w:t>
+      </w:r>
+      <w:r>
+        <w:t xml:space="preserve"> </w:t>
+      </w:r>
+      <w:r>
+        <w:rPr>
+          <w:b/>
+          <w:bCs/>
+        </w:rPr>
+        <w:t xml:space="preserve">~85 000 F/véhicule</w:t>
+      </w:r>
+      <w:r>
+        <w:t xml:space="preserve"> </w:t>
+      </w:r>
+      <w:r>
+        <w:t xml:space="preserve">·</w:t>
+      </w:r>
+      <w:r>
+        <w:t xml:space="preserve"> </w:t>
+      </w:r>
+      <w:r>
+        <w:rPr>
+          <w:b/>
+          <w:bCs/>
+        </w:rPr>
+        <w:t xml:space="preserve">LTV/CAC &gt; 4</w:t>
+      </w:r>
+      <w:r>
+        <w:t xml:space="preserve"> </w:t>
+      </w:r>
+      <w:r>
+        <w:t xml:space="preserve">dès M12.</w:t>
       </w:r>
     </w:p>
     <w:tbl>
@@ -1099,72 +1157,6 @@
         </w:tc>
       </w:tr>
     </w:tbl>
-    <w:p>
-      <w:pPr>
-        <w:pStyle w:val="BodyText"/>
-      </w:pPr>
-      <w:r>
-        <w:rPr>
-          <w:b/>
-          <w:bCs/>
-        </w:rPr>
-        <w:t xml:space="preserve">Unit economics</w:t>
-      </w:r>
-      <w:r>
-        <w:t xml:space="preserve"> </w:t>
-      </w:r>
-      <w:r>
-        <w:t xml:space="preserve">: revenu net</w:t>
-      </w:r>
-      <w:r>
-        <w:t xml:space="preserve"> </w:t>
-      </w:r>
-      <w:r>
-        <w:rPr>
-          <w:b/>
-          <w:bCs/>
-        </w:rPr>
-        <w:t xml:space="preserve">2 560 F/commande</w:t>
-      </w:r>
-      <w:r>
-        <w:t xml:space="preserve"> </w:t>
-      </w:r>
-      <w:r>
-        <w:t xml:space="preserve">· LTV Flotte Pro</w:t>
-      </w:r>
-      <w:r>
-        <w:t xml:space="preserve"> </w:t>
-      </w:r>
-      <w:r>
-        <w:rPr>
-          <w:b/>
-          <w:bCs/>
-        </w:rPr>
-        <w:t xml:space="preserve">~85 000 F/véhicule</w:t>
-      </w:r>
-      <w:r>
-        <w:t xml:space="preserve"> </w:t>
-      </w:r>
-      <w:r>
-        <w:t xml:space="preserve">·</w:t>
-      </w:r>
-      <w:r>
-        <w:t xml:space="preserve"> </w:t>
-      </w:r>
-      <w:r>
-        <w:rPr>
-          <w:b/>
-          <w:bCs/>
-        </w:rPr>
-        <w:t xml:space="preserve">LTV/CAC &gt; 4</w:t>
-      </w:r>
-      <w:r>
-        <w:t xml:space="preserve"> </w:t>
-      </w:r>
-      <w:r>
-        <w:t xml:space="preserve">dès M12.</w:t>
-      </w:r>
-    </w:p>
     <w:bookmarkEnd w:id="15"/>
     <w:bookmarkStart w:id="16" w:name="go-to-market--5-mouvements"/>
     <w:p>
@@ -1763,6 +1755,37 @@
         <w:t xml:space="preserve">La demande</w:t>
       </w:r>
     </w:p>
+    <w:p>
+      <w:pPr>
+        <w:pStyle w:val="FirstParagraph"/>
+      </w:pPr>
+      <w:r>
+        <w:rPr>
+          <w:b/>
+          <w:bCs/>
+        </w:rPr>
+        <w:t xml:space="preserve">Jalons débloqués</w:t>
+      </w:r>
+      <w:r>
+        <w:t xml:space="preserve"> </w:t>
+      </w:r>
+      <w:r>
+        <w:t xml:space="preserve">: 1 500 véhicules abonnés, 600 commandes/jour, GMV &gt; 250 M F/mois, break-even Abidjan à M18 →</w:t>
+      </w:r>
+      <w:r>
+        <w:t xml:space="preserve"> </w:t>
+      </w:r>
+      <w:r>
+        <w:rPr>
+          <w:b/>
+          <w:bCs/>
+        </w:rPr>
+        <w:t xml:space="preserve">Série A 4–7 M USD</w:t>
+      </w:r>
+      <w:r>
+        <w:t xml:space="preserve">.</w:t>
+      </w:r>
+    </w:p>
     <w:tbl>
       <w:tblPr>
         <w:tblStyle w:val="Table"/>
@@ -1921,37 +1944,6 @@
         </w:tc>
       </w:tr>
     </w:tbl>
-    <w:p>
-      <w:pPr>
-        <w:pStyle w:val="BodyText"/>
-      </w:pPr>
-      <w:r>
-        <w:rPr>
-          <w:b/>
-          <w:bCs/>
-        </w:rPr>
-        <w:t xml:space="preserve">Jalons débloqués</w:t>
-      </w:r>
-      <w:r>
-        <w:t xml:space="preserve"> </w:t>
-      </w:r>
-      <w:r>
-        <w:t xml:space="preserve">: 1 500 véhicules abonnés, 600 commandes/jour, GMV &gt; 250 M F/mois, break-even Abidjan à M18 →</w:t>
-      </w:r>
-      <w:r>
-        <w:t xml:space="preserve"> </w:t>
-      </w:r>
-      <w:r>
-        <w:rPr>
-          <w:b/>
-          <w:bCs/>
-        </w:rPr>
-        <w:t xml:space="preserve">Série A 4–7 M USD</w:t>
-      </w:r>
-      <w:r>
-        <w:t xml:space="preserve">.</w:t>
-      </w:r>
-    </w:p>
     <w:bookmarkEnd w:id="19"/>
     <w:bookmarkStart w:id="21" w:name="vision"/>
     <w:p>

</xml_diff>

<commit_message>
docs: reformule la douve Liaison (cartographie de toute la chaîne)
Liaison digitalise les vendeurs formels ET informels (importateur en gros →
détaillant) ; la douve = cartographie des acteurs + digitalisation de leurs
produits même hors ligne. Plan d'affaires + pitch deck.

Co-Authored-By: Claude Opus 4.8 (1M context) <noreply@anthropic.com>
</commit_message>
<xml_diff>
--- a/docs/pitch-deck-pieces-2026-06.docx
+++ b/docs/pitch-deck-pieces-2026-06.docx
@@ -264,7 +264,20 @@
         <w:t xml:space="preserve"> </w:t>
       </w:r>
       <w:r>
-        <w:t xml:space="preserve">— des agents terrain digitalisent les vendeurs informels, sans smartphone requis.</w:t>
+        <w:t xml:space="preserve">— des agents terrain digitalisent les vendeurs</w:t>
+      </w:r>
+      <w:r>
+        <w:t xml:space="preserve"> </w:t>
+      </w:r>
+      <w:r>
+        <w:rPr>
+          <w:b/>
+          <w:bCs/>
+        </w:rPr>
+        <w:t xml:space="preserve">formels et informels</w:t>
+      </w:r>
+      <w:r>
+        <w:t xml:space="preserve">, de l'importateur en gros au détaillant — même hors ligne.</w:t>
       </w:r>
     </w:p>
     <w:bookmarkEnd w:id="10"/>
@@ -1355,13 +1368,13 @@
           <w:b/>
           <w:bCs/>
         </w:rPr>
-        <w:t xml:space="preserve">Réseau Liaison</w:t>
-      </w:r>
-      <w:r>
-        <w:t xml:space="preserve"> </w:t>
-      </w:r>
-      <w:r>
-        <w:t xml:space="preserve">(objectif 80 agents en 12 mois).</w:t>
+        <w:t xml:space="preserve">Cartographie de la chaîne + réseau Liaison</w:t>
+      </w:r>
+      <w:r>
+        <w:t xml:space="preserve"> </w:t>
+      </w:r>
+      <w:r>
+        <w:t xml:space="preserve">— tous les acteurs (gros → détail, formels &amp; informels) et leurs produits digitalisés, même hors ligne (objectif 80 agents en 12 mois).</w:t>
       </w:r>
     </w:p>
     <w:p>

</xml_diff>

<commit_message>
docs: cadre le problème sur l'empilement des marges d'intermédiaires
Tout intermédiaire (importateur→grossiste→détaillant→mécanicien) ajoute une
marge opaque ; Pièces rend la chaîne transparente et concurrentielle. Plan + deck.

Co-Authored-By: Claude Opus 4.8 (1M context) <noreply@anthropic.com>
</commit_message>
<xml_diff>
--- a/docs/pitch-deck-pieces-2026-06.docx
+++ b/docs/pitch-deck-pieces-2026-06.docx
@@ -46,6 +46,24 @@
     </w:p>
     <w:p>
       <w:pPr>
+        <w:pStyle w:val="BodyText"/>
+      </w:pPr>
+      <w:r>
+        <w:rPr>
+          <w:b/>
+          <w:bCs/>
+        </w:rPr>
+        <w:t xml:space="preserve">Chaque intermédiaire ajoute sa marge</w:t>
+      </w:r>
+      <w:r>
+        <w:t xml:space="preserve"> </w:t>
+      </w:r>
+      <w:r>
+        <w:t xml:space="preserve">— importateur, grossiste, détaillant, mécanicien : l'acheteur paie l'accumulation, sans jamais voir le vrai prix.</w:t>
+      </w:r>
+    </w:p>
+    <w:p>
+      <w:pPr>
         <w:pStyle w:val="Compact"/>
         <w:numPr>
           <w:ilvl w:val="0"/>
@@ -57,13 +75,13 @@
           <w:b/>
           <w:bCs/>
         </w:rPr>
-        <w:t xml:space="preserve">Mécanicien</w:t>
-      </w:r>
-      <w:r>
-        <w:t xml:space="preserve"> </w:t>
-      </w:r>
-      <w:r>
-        <w:t xml:space="preserve">: perd 2 à 4 h par pièce à faire le tour des cantines.</w:t>
+        <w:t xml:space="preserve">Propriétaire</w:t>
+      </w:r>
+      <w:r>
+        <w:t xml:space="preserve"> </w:t>
+      </w:r>
+      <w:r>
+        <w:t xml:space="preserve">: paie 30 à 60 % trop cher, sans garantie.</w:t>
       </w:r>
     </w:p>
     <w:p>
@@ -79,13 +97,29 @@
           <w:b/>
           <w:bCs/>
         </w:rPr>
-        <w:t xml:space="preserve">Propriétaire</w:t>
-      </w:r>
-      <w:r>
-        <w:t xml:space="preserve"> </w:t>
-      </w:r>
-      <w:r>
-        <w:t xml:space="preserve">: paie 30 à 60 % trop cher, sans garantie.</w:t>
+        <w:t xml:space="preserve">Flotte</w:t>
+      </w:r>
+      <w:r>
+        <w:t xml:space="preserve"> </w:t>
+      </w:r>
+      <w:r>
+        <w:t xml:space="preserve">: perd</w:t>
+      </w:r>
+      <w:r>
+        <w:t xml:space="preserve"> </w:t>
+      </w:r>
+      <w:r>
+        <w:rPr>
+          <w:b/>
+          <w:bCs/>
+        </w:rPr>
+        <w:t xml:space="preserve">30 000 à 50 000 F/jour</w:t>
+      </w:r>
+      <w:r>
+        <w:t xml:space="preserve"> </w:t>
+      </w:r>
+      <w:r>
+        <w:t xml:space="preserve">par véhicule immobilisé ; budget pièces opaque.</w:t>
       </w:r>
     </w:p>
     <w:p>
@@ -101,51 +135,13 @@
           <w:b/>
           <w:bCs/>
         </w:rPr>
-        <w:t xml:space="preserve">Flotte</w:t>
-      </w:r>
-      <w:r>
-        <w:t xml:space="preserve"> </w:t>
-      </w:r>
-      <w:r>
-        <w:t xml:space="preserve">: perd</w:t>
-      </w:r>
-      <w:r>
-        <w:t xml:space="preserve"> </w:t>
-      </w:r>
-      <w:r>
-        <w:rPr>
-          <w:b/>
-          <w:bCs/>
-        </w:rPr>
-        <w:t xml:space="preserve">30 000 à 50 000 F/jour</w:t>
-      </w:r>
-      <w:r>
-        <w:t xml:space="preserve"> </w:t>
-      </w:r>
-      <w:r>
-        <w:t xml:space="preserve">par véhicule immobilisé.</w:t>
-      </w:r>
-    </w:p>
-    <w:p>
-      <w:pPr>
-        <w:pStyle w:val="Compact"/>
-        <w:numPr>
-          <w:ilvl w:val="0"/>
-          <w:numId w:val="1001"/>
-        </w:numPr>
-      </w:pPr>
-      <w:r>
-        <w:rPr>
-          <w:b/>
-          <w:bCs/>
-        </w:rPr>
         <w:t xml:space="preserve">Vendeur</w:t>
       </w:r>
       <w:r>
         <w:t xml:space="preserve"> </w:t>
       </w:r>
       <w:r>
-        <w:t xml:space="preserve">: enfermé dans sa cantine, invisible en ligne.</w:t>
+        <w:t xml:space="preserve">: enfermé dans son comptoir, invisible en ligne.</w:t>
       </w:r>
     </w:p>
     <w:p>

</xml_diff>

<commit_message>
docs(pitch-deck): aligne le deck sur le plan d'affaires v1.3
Pre-seed ~1 M EUR (au lieu de Seed 1,5 M USD), next round Seed 4-6 M EUR,
take rate 10 %, paiement à la livraison, « largement informel »,
retrait de Gemini, perte flotte 25-50k F/jour. Rebuild PDF/DOCX/PPTX.

Co-Authored-By: Claude Opus 4.8 (1M context) <noreply@anthropic.com>
</commit_message>
<xml_diff>
--- a/docs/pitch-deck-pieces-2026-06.docx
+++ b/docs/pitch-deck-pieces-2026-06.docx
@@ -35,7 +35,7 @@
           <w:b/>
           <w:bCs/>
         </w:rPr>
-        <w:t xml:space="preserve">100 % informel</w:t>
+        <w:t xml:space="preserve">largement informel</w:t>
       </w:r>
       <w:r>
         <w:t xml:space="preserve"> </w:t>
@@ -113,7 +113,7 @@
           <w:b/>
           <w:bCs/>
         </w:rPr>
-        <w:t xml:space="preserve">30 000 à 50 000 F/jour</w:t>
+        <w:t xml:space="preserve">25 000 à 50 000 F/jour</w:t>
       </w:r>
       <w:r>
         <w:t xml:space="preserve"> </w:t>
@@ -203,20 +203,20 @@
         <w:t xml:space="preserve"> </w:t>
       </w:r>
       <w:r>
-        <w:t xml:space="preserve">— le mécanicien identifie, le propriétaire paie en</w:t>
-      </w:r>
-      <w:r>
-        <w:t xml:space="preserve"> </w:t>
-      </w:r>
-      <w:r>
-        <w:rPr>
-          <w:b/>
-          <w:bCs/>
-        </w:rPr>
-        <w:t xml:space="preserve">escrow Mobile Money</w:t>
-      </w:r>
-      <w:r>
-        <w:t xml:space="preserve">, le vendeur livre. Prix et condition affichés, garantie, facture.</w:t>
+        <w:t xml:space="preserve">— le mécanicien identifie, le vendeur livre, le propriétaire</w:t>
+      </w:r>
+      <w:r>
+        <w:t xml:space="preserve"> </w:t>
+      </w:r>
+      <w:r>
+        <w:rPr>
+          <w:b/>
+          <w:bCs/>
+        </w:rPr>
+        <w:t xml:space="preserve">paie à la livraison</w:t>
+      </w:r>
+      <w:r>
+        <w:t xml:space="preserve">. Prix et condition affichés, garantie, facture.</w:t>
       </w:r>
     </w:p>
     <w:p>
@@ -305,7 +305,7 @@
           <w:b/>
           <w:bCs/>
         </w:rPr>
-        <w:t xml:space="preserve">escrow Mobile Money</w:t>
+        <w:t xml:space="preserve">paiement à la livraison</w:t>
       </w:r>
       <w:r>
         <w:t xml:space="preserve">, garantie, facture — en production.</w:t>
@@ -330,7 +330,7 @@
           <w:b/>
           <w:bCs/>
         </w:rPr>
-        <w:t xml:space="preserve">texte / photo IA (Gemini) / VIN</w:t>
+        <w:t xml:space="preserve">texte / photo IA / VIN</w:t>
       </w:r>
       <w:r>
         <w:t xml:space="preserve">, fitment véhicule CI.</w:t>
@@ -455,7 +455,7 @@
         <w:t xml:space="preserve">~400–420 Mds F/an</w:t>
       </w:r>
       <w:r>
-        <w:t xml:space="preserve">. À une take rate de 9–12 %, le SOM représente</w:t>
+        <w:t xml:space="preserve">. À une take rate de ~10 %, le SOM représente</w:t>
       </w:r>
       <w:r>
         <w:t xml:space="preserve"> </w:t>
@@ -468,10 +468,7 @@
         <w:t xml:space="preserve">4–6 Mds FCFA de revenu net annuel</w:t>
       </w:r>
       <w:r>
-        <w:t xml:space="preserve"> </w:t>
-      </w:r>
-      <w:r>
-        <w:t xml:space="preserve">(~6–10 M USD).</w:t>
+        <w:t xml:space="preserve">.</w:t>
       </w:r>
     </w:p>
     <w:tbl>
@@ -712,7 +709,7 @@
         <w:t xml:space="preserve"> </w:t>
       </w:r>
       <w:r>
-        <w:t xml:space="preserve">(Orange Money, MTN, Wave) → l'escrow devient possible.</w:t>
+        <w:t xml:space="preserve">(Orange Money, MTN, Wave) → paiement à la livraison fiable et traçable.</w:t>
       </w:r>
     </w:p>
     <w:p>
@@ -925,17 +922,46 @@
         <w:t xml:space="preserve"> </w:t>
       </w:r>
       <w:r>
-        <w:t xml:space="preserve">: revenu net</w:t>
-      </w:r>
-      <w:r>
-        <w:t xml:space="preserve"> </w:t>
-      </w:r>
-      <w:r>
-        <w:rPr>
-          <w:b/>
-          <w:bCs/>
-        </w:rPr>
-        <w:t xml:space="preserve">2 560 F/commande</w:t>
+        <w:t xml:space="preserve">: panier moyen</w:t>
+      </w:r>
+      <w:r>
+        <w:t xml:space="preserve"> </w:t>
+      </w:r>
+      <w:r>
+        <w:rPr>
+          <w:b/>
+          <w:bCs/>
+        </w:rPr>
+        <w:t xml:space="preserve">32 000 F</w:t>
+      </w:r>
+      <w:r>
+        <w:t xml:space="preserve">, take rate</w:t>
+      </w:r>
+      <w:r>
+        <w:t xml:space="preserve"> </w:t>
+      </w:r>
+      <w:r>
+        <w:rPr>
+          <w:b/>
+          <w:bCs/>
+        </w:rPr>
+        <w:t xml:space="preserve">10 %</w:t>
+      </w:r>
+      <w:r>
+        <w:t xml:space="preserve"> </w:t>
+      </w:r>
+      <w:r>
+        <w:t xml:space="preserve">→</w:t>
+      </w:r>
+      <w:r>
+        <w:t xml:space="preserve"> </w:t>
+      </w:r>
+      <w:r>
+        <w:rPr>
+          <w:b/>
+          <w:bCs/>
+        </w:rPr>
+        <w:t xml:space="preserve">3 200 F/commande</w:t>
       </w:r>
       <w:r>
         <w:t xml:space="preserve"> </w:t>
@@ -1044,7 +1070,7 @@
               <w:pStyle w:val="Compact"/>
             </w:pPr>
             <w:r>
-              <w:t xml:space="preserve">5–10 % côté vendeur</w:t>
+              <w:t xml:space="preserve">7–15 %, au paiement</w:t>
             </w:r>
           </w:p>
         </w:tc>
@@ -1408,7 +1434,7 @@
           <w:b/>
           <w:bCs/>
         </w:rPr>
-        <w:t xml:space="preserve">Escrow + garantie</w:t>
+        <w:t xml:space="preserve">Paiement à la livraison + garantie</w:t>
       </w:r>
       <w:r>
         <w:t xml:space="preserve"> </w:t>
@@ -1789,7 +1815,7 @@
           <w:b/>
           <w:bCs/>
         </w:rPr>
-        <w:t xml:space="preserve">Série A 4–7 M USD</w:t>
+        <w:t xml:space="preserve">Seed 4–6 M EUR</w:t>
       </w:r>
       <w:r>
         <w:t xml:space="preserve">.</w:t>

</xml_diff>